<commit_message>
Use info@jaosefagrosupplies.co.ke on letterhead and quotation
Co-Authored-By: Claude Fable 5.1 <noreply@anthropic.com>
Claude-Session: https://claude.ai/code/session_01VxmN9LbCg42n7NoCjitwBo
</commit_message>
<xml_diff>
--- a/docs/letterhead/Jaosef-Agro-Supplies-Letterhead-Blank.docx
+++ b/docs/letterhead/Jaosef-Agro-Supplies-Letterhead-Blank.docx
@@ -268,7 +268,7 @@
         <w:sz w:val="16"/>
         <w:szCs w:val="16"/>
       </w:rPr>
-      <w:t xml:space="preserve">jaosefagrosupplies@gmail.com</w:t>
+      <w:t xml:space="preserve">info@jaosefagrosupplies.co.ke</w:t>
     </w:r>
     <w:r>
       <w:rPr>
@@ -504,7 +504,7 @@
               <w:sz w:val="17"/>
               <w:szCs w:val="17"/>
             </w:rPr>
-            <w:t xml:space="preserve">jaosefagrosupplies@gmail.com</w:t>
+            <w:t xml:space="preserve">info@jaosefagrosupplies.co.ke</w:t>
           </w:r>
         </w:p>
         <w:p>

</xml_diff>